<commit_message>
Add text editing exam variants
</commit_message>
<xml_diff>
--- a/project-resources/pisemka-uprava-textu-spanek/hodnoceni-typografickych-chyb.docx
+++ b/project-resources/pisemka-uprava-textu-spanek/hodnoceni-typografickych-chyb.docx
@@ -54,6 +54,7 @@
           </w:tcPr>
           <w:p>
             <w:pPr>
+              <w:spacing w:after="0" w:line="216" w:lineRule="auto"/>
               <w:jc w:val="left"/>
             </w:pPr>
             <w:r/>
@@ -62,7 +63,7 @@
                 <w:rFonts w:ascii="Arial" w:hAnsi="Arial"/>
                 <w:b/>
                 <w:color w:val="FFFFFF"/>
-                <w:sz w:val="20"/>
+                <w:sz w:val="18"/>
               </w:rPr>
               <w:t>Typ chyby</w:t>
             </w:r>
@@ -76,6 +77,7 @@
           </w:tcPr>
           <w:p>
             <w:pPr>
+              <w:spacing w:after="0" w:line="216" w:lineRule="auto"/>
               <w:jc w:val="left"/>
             </w:pPr>
             <w:r/>
@@ -84,7 +86,7 @@
                 <w:rFonts w:ascii="Arial" w:hAnsi="Arial"/>
                 <w:b/>
                 <w:color w:val="FFFFFF"/>
-                <w:sz w:val="20"/>
+                <w:sz w:val="18"/>
               </w:rPr>
               <w:t>Váha</w:t>
             </w:r>
@@ -99,6 +101,7 @@
           </w:tcPr>
           <w:p>
             <w:pPr>
+              <w:spacing w:after="0" w:line="216" w:lineRule="auto"/>
               <w:jc w:val="left"/>
             </w:pPr>
             <w:r/>
@@ -106,7 +109,7 @@
               <w:rPr>
                 <w:rFonts w:ascii="Arial" w:hAnsi="Arial"/>
                 <w:b w:val="0"/>
-                <w:sz w:val="20"/>
+                <w:sz w:val="18"/>
               </w:rPr>
               <w:t>malá chyba</w:t>
             </w:r>
@@ -119,6 +122,7 @@
           </w:tcPr>
           <w:p>
             <w:pPr>
+              <w:spacing w:after="0" w:line="216" w:lineRule="auto"/>
               <w:jc w:val="left"/>
             </w:pPr>
             <w:r/>
@@ -126,7 +130,7 @@
               <w:rPr>
                 <w:rFonts w:ascii="Arial" w:hAnsi="Arial"/>
                 <w:b w:val="0"/>
-                <w:sz w:val="20"/>
+                <w:sz w:val="18"/>
               </w:rPr>
               <w:t>0,5 chyby</w:t>
             </w:r>
@@ -141,6 +145,7 @@
           </w:tcPr>
           <w:p>
             <w:pPr>
+              <w:spacing w:after="0" w:line="216" w:lineRule="auto"/>
               <w:jc w:val="left"/>
             </w:pPr>
             <w:r/>
@@ -148,7 +153,7 @@
               <w:rPr>
                 <w:rFonts w:ascii="Arial" w:hAnsi="Arial"/>
                 <w:b w:val="0"/>
-                <w:sz w:val="20"/>
+                <w:sz w:val="18"/>
               </w:rPr>
               <w:t>běžná chyba</w:t>
             </w:r>
@@ -161,6 +166,7 @@
           </w:tcPr>
           <w:p>
             <w:pPr>
+              <w:spacing w:after="0" w:line="216" w:lineRule="auto"/>
               <w:jc w:val="left"/>
             </w:pPr>
             <w:r/>
@@ -168,7 +174,7 @@
               <w:rPr>
                 <w:rFonts w:ascii="Arial" w:hAnsi="Arial"/>
                 <w:b w:val="0"/>
-                <w:sz w:val="20"/>
+                <w:sz w:val="18"/>
               </w:rPr>
               <w:t>1 chyba</w:t>
             </w:r>
@@ -183,6 +189,7 @@
           </w:tcPr>
           <w:p>
             <w:pPr>
+              <w:spacing w:after="0" w:line="216" w:lineRule="auto"/>
               <w:jc w:val="left"/>
             </w:pPr>
             <w:r/>
@@ -190,7 +197,7 @@
               <w:rPr>
                 <w:rFonts w:ascii="Arial" w:hAnsi="Arial"/>
                 <w:b w:val="0"/>
-                <w:sz w:val="20"/>
+                <w:sz w:val="18"/>
               </w:rPr>
               <w:t>hrubá chyba</w:t>
             </w:r>
@@ -203,6 +210,7 @@
           </w:tcPr>
           <w:p>
             <w:pPr>
+              <w:spacing w:after="0" w:line="216" w:lineRule="auto"/>
               <w:jc w:val="left"/>
             </w:pPr>
             <w:r/>
@@ -210,7 +218,7 @@
               <w:rPr>
                 <w:rFonts w:ascii="Arial" w:hAnsi="Arial"/>
                 <w:b w:val="0"/>
-                <w:sz w:val="20"/>
+                <w:sz w:val="18"/>
               </w:rPr>
               <w:t>3 chyby</w:t>
             </w:r>
@@ -571,6 +579,7 @@
           </w:tcPr>
           <w:p>
             <w:pPr>
+              <w:spacing w:after="0" w:line="216" w:lineRule="auto"/>
               <w:jc w:val="left"/>
             </w:pPr>
             <w:r/>
@@ -579,7 +588,7 @@
                 <w:rFonts w:ascii="Arial" w:hAnsi="Arial"/>
                 <w:b/>
                 <w:color w:val="FFFFFF"/>
-                <w:sz w:val="20"/>
+                <w:sz w:val="18"/>
               </w:rPr>
               <w:t>Známka</w:t>
             </w:r>
@@ -593,6 +602,7 @@
           </w:tcPr>
           <w:p>
             <w:pPr>
+              <w:spacing w:after="0" w:line="216" w:lineRule="auto"/>
               <w:jc w:val="left"/>
             </w:pPr>
             <w:r/>
@@ -601,7 +611,7 @@
                 <w:rFonts w:ascii="Arial" w:hAnsi="Arial"/>
                 <w:b/>
                 <w:color w:val="FFFFFF"/>
-                <w:sz w:val="20"/>
+                <w:sz w:val="18"/>
               </w:rPr>
               <w:t>Přepočtené chyby</w:t>
             </w:r>
@@ -616,6 +626,7 @@
           </w:tcPr>
           <w:p>
             <w:pPr>
+              <w:spacing w:after="0" w:line="216" w:lineRule="auto"/>
               <w:jc w:val="left"/>
             </w:pPr>
             <w:r/>
@@ -623,7 +634,7 @@
               <w:rPr>
                 <w:rFonts w:ascii="Arial" w:hAnsi="Arial"/>
                 <w:b w:val="0"/>
-                <w:sz w:val="20"/>
+                <w:sz w:val="18"/>
               </w:rPr>
               <w:t>1</w:t>
             </w:r>
@@ -636,6 +647,7 @@
           </w:tcPr>
           <w:p>
             <w:pPr>
+              <w:spacing w:after="0" w:line="216" w:lineRule="auto"/>
               <w:jc w:val="left"/>
             </w:pPr>
             <w:r/>
@@ -643,7 +655,7 @@
               <w:rPr>
                 <w:rFonts w:ascii="Arial" w:hAnsi="Arial"/>
                 <w:b w:val="0"/>
-                <w:sz w:val="20"/>
+                <w:sz w:val="18"/>
               </w:rPr>
               <w:t>0-3</w:t>
             </w:r>
@@ -658,6 +670,7 @@
           </w:tcPr>
           <w:p>
             <w:pPr>
+              <w:spacing w:after="0" w:line="216" w:lineRule="auto"/>
               <w:jc w:val="left"/>
             </w:pPr>
             <w:r/>
@@ -665,7 +678,7 @@
               <w:rPr>
                 <w:rFonts w:ascii="Arial" w:hAnsi="Arial"/>
                 <w:b w:val="0"/>
-                <w:sz w:val="20"/>
+                <w:sz w:val="18"/>
               </w:rPr>
               <w:t>2</w:t>
             </w:r>
@@ -678,6 +691,7 @@
           </w:tcPr>
           <w:p>
             <w:pPr>
+              <w:spacing w:after="0" w:line="216" w:lineRule="auto"/>
               <w:jc w:val="left"/>
             </w:pPr>
             <w:r/>
@@ -685,7 +699,7 @@
               <w:rPr>
                 <w:rFonts w:ascii="Arial" w:hAnsi="Arial"/>
                 <w:b w:val="0"/>
-                <w:sz w:val="20"/>
+                <w:sz w:val="18"/>
               </w:rPr>
               <w:t>3,5-7</w:t>
             </w:r>
@@ -700,6 +714,7 @@
           </w:tcPr>
           <w:p>
             <w:pPr>
+              <w:spacing w:after="0" w:line="216" w:lineRule="auto"/>
               <w:jc w:val="left"/>
             </w:pPr>
             <w:r/>
@@ -707,7 +722,7 @@
               <w:rPr>
                 <w:rFonts w:ascii="Arial" w:hAnsi="Arial"/>
                 <w:b w:val="0"/>
-                <w:sz w:val="20"/>
+                <w:sz w:val="18"/>
               </w:rPr>
               <w:t>3</w:t>
             </w:r>
@@ -720,6 +735,7 @@
           </w:tcPr>
           <w:p>
             <w:pPr>
+              <w:spacing w:after="0" w:line="216" w:lineRule="auto"/>
               <w:jc w:val="left"/>
             </w:pPr>
             <w:r/>
@@ -727,7 +743,7 @@
               <w:rPr>
                 <w:rFonts w:ascii="Arial" w:hAnsi="Arial"/>
                 <w:b w:val="0"/>
-                <w:sz w:val="20"/>
+                <w:sz w:val="18"/>
               </w:rPr>
               <w:t>7,5-11</w:t>
             </w:r>
@@ -742,6 +758,7 @@
           </w:tcPr>
           <w:p>
             <w:pPr>
+              <w:spacing w:after="0" w:line="216" w:lineRule="auto"/>
               <w:jc w:val="left"/>
             </w:pPr>
             <w:r/>
@@ -749,7 +766,7 @@
               <w:rPr>
                 <w:rFonts w:ascii="Arial" w:hAnsi="Arial"/>
                 <w:b w:val="0"/>
-                <w:sz w:val="20"/>
+                <w:sz w:val="18"/>
               </w:rPr>
               <w:t>4</w:t>
             </w:r>
@@ -762,6 +779,7 @@
           </w:tcPr>
           <w:p>
             <w:pPr>
+              <w:spacing w:after="0" w:line="216" w:lineRule="auto"/>
               <w:jc w:val="left"/>
             </w:pPr>
             <w:r/>
@@ -769,7 +787,7 @@
               <w:rPr>
                 <w:rFonts w:ascii="Arial" w:hAnsi="Arial"/>
                 <w:b w:val="0"/>
-                <w:sz w:val="20"/>
+                <w:sz w:val="18"/>
               </w:rPr>
               <w:t>11,5-15</w:t>
             </w:r>
@@ -784,6 +802,7 @@
           </w:tcPr>
           <w:p>
             <w:pPr>
+              <w:spacing w:after="0" w:line="216" w:lineRule="auto"/>
               <w:jc w:val="left"/>
             </w:pPr>
             <w:r/>
@@ -791,7 +810,7 @@
               <w:rPr>
                 <w:rFonts w:ascii="Arial" w:hAnsi="Arial"/>
                 <w:b w:val="0"/>
-                <w:sz w:val="20"/>
+                <w:sz w:val="18"/>
               </w:rPr>
               <w:t>5</w:t>
             </w:r>
@@ -804,6 +823,7 @@
           </w:tcPr>
           <w:p>
             <w:pPr>
+              <w:spacing w:after="0" w:line="216" w:lineRule="auto"/>
               <w:jc w:val="left"/>
             </w:pPr>
             <w:r/>
@@ -811,7 +831,7 @@
               <w:rPr>
                 <w:rFonts w:ascii="Arial" w:hAnsi="Arial"/>
                 <w:b w:val="0"/>
-                <w:sz w:val="20"/>
+                <w:sz w:val="18"/>
               </w:rPr>
               <w:t>15,5 a více</w:t>
             </w:r>
@@ -822,19 +842,56 @@
     <w:p/>
     <w:p>
       <w:pPr>
-        <w:spacing w:after="120" w:line="259" w:lineRule="auto"/>
+        <w:pStyle w:val="Heading2"/>
+        <w:spacing w:before="80" w:after="0"/>
       </w:pPr>
       <w:r>
         <w:rPr>
           <w:rFonts w:ascii="Arial" w:hAnsi="Arial"/>
-          <w:sz w:val="22"/>
+          <w:color w:val="000000"/>
+        </w:rPr>
+        <w:t>Převod chyb na procenta</w:t>
+      </w:r>
+    </w:p>
+    <w:p>
+      <w:pPr>
+        <w:spacing w:after="40" w:line="230" w:lineRule="auto"/>
+      </w:pPr>
+      <w:r>
+        <w:rPr>
+          <w:rFonts w:ascii="Arial" w:hAnsi="Arial"/>
+          <w:sz w:val="18"/>
+        </w:rPr>
+        <w:t>Pro orientační procentní hodnocení použijte převod: procenta = 100 - počet přepočtených chyb × 5. Výsledek se počítá z přepočtených chyb po započtení váhy malé, běžné a hrubé chyby. Pokud by výsledek vyšel pod 0 %, zapíše se 0 %.</w:t>
+      </w:r>
+    </w:p>
+    <w:p>
+      <w:pPr>
+        <w:spacing w:after="40" w:line="230" w:lineRule="auto"/>
+      </w:pPr>
+      <w:r>
+        <w:rPr>
+          <w:rFonts w:ascii="Arial" w:hAnsi="Arial"/>
+          <w:sz w:val="18"/>
+        </w:rPr>
+        <w:t>Příklad: 6 přepočtených chyb = 100 - 6 × 5 = 70 %. Šest přepočtených chyb tedy odpovídá 70 %, což spadá do známky 2.</w:t>
+      </w:r>
+    </w:p>
+    <w:p>
+      <w:pPr>
+        <w:spacing w:after="40" w:line="230" w:lineRule="auto"/>
+      </w:pPr>
+      <w:r>
+        <w:rPr>
+          <w:rFonts w:ascii="Arial" w:hAnsi="Arial"/>
+          <w:sz w:val="18"/>
         </w:rPr>
         <w:t>Opakovaná stejná chyba se nepočítá neomezeně. Pokud se stejný typ chyby opakuje v celém dokumentu, započítá se obvykle podle rozsahu jako 2-3 chyby.</w:t>
       </w:r>
     </w:p>
     <w:sectPr>
       <w:pgSz w:w="12240" w:h="15840"/>
-      <w:pgMar w:top="794" w:right="907" w:bottom="794" w:left="907" w:header="720" w:footer="720" w:gutter="0"/>
+      <w:pgMar w:top="567" w:right="907" w:bottom="567" w:left="907" w:header="720" w:footer="720" w:gutter="0"/>
       <w:cols w:space="720"/>
       <w:docGrid w:linePitch="360"/>
     </w:sectPr>

</xml_diff>